<commit_message>
BEDROCK-45: CREDIX1 versión 2.1 con datos verificados
Nombre completo de los socios en la guía. Contacto de la SIC, la
Superintendencia Financiera, Coopcentral y su Defensor en el Anexo 3 del
contrato del cliente. NIT y domicilio de Coopcentral en el contrato marco.
Las versiones 2.0 pasan a versiones-anteriores como -v2.

Co-Authored-By: Claude Opus 5.5 <noreply@anthropic.com>
</commit_message>
<xml_diff>
--- a/Clientes/credix1/documentos-legales/contratos/Contrato-Cliente-CREDIX1.docx
+++ b/Clientes/credix1/documentos-legales/contratos/Contrato-Cliente-CREDIX1.docx
@@ -162,7 +162,7 @@
                 <w:color w:val="1B1D36"/>
                 <w:sz w:val="20"/>
               </w:rPr>
-              <w:t xml:space="preserve">5 de octubre de 2026</w:t>
+              <w:t xml:space="preserve">6 de octubre de 2026</w:t>
             </w:r>
           </w:p>
         </w:tc>
@@ -4009,7 +4009,7 @@
               <w:pStyle w:val="Compact"/>
             </w:pPr>
             <w:r>
-              <w:t xml:space="preserve">[DATOS DE CONTACTO VIGENTES DE LA SIC]</w:t>
+              <w:t xml:space="preserve">Calle 24 No. 7-43, Bogotá D.C. · Línea de atención +57 601 592 0400 · Línea gratuita nacional 01 8000 910165 · www.sic.gov.co · Lunes a viernes, 8:00 a. m. a 4:30 p. m.</w:t>
             </w:r>
           </w:p>
         </w:tc>
@@ -4044,7 +4044,7 @@
               <w:pStyle w:val="Compact"/>
             </w:pPr>
             <w:r>
-              <w:t xml:space="preserve">[DATOS DE CONTACTO DE COOPCENTRAL]</w:t>
+              <w:t xml:space="preserve">Avenida Calle 116 No. 23-06/28, piso 6, Bogotá D.C. · PBX +57 601 743 1088 · Línea nacional 01 8000 181088 · sac@coopcentral.com.co · www.coopcentral.com.co</w:t>
             </w:r>
           </w:p>
         </w:tc>
@@ -4079,7 +4079,7 @@
               <w:pStyle w:val="Compact"/>
             </w:pPr>
             <w:r>
-              <w:t xml:space="preserve">[DATOS DEL DEFENSOR]</w:t>
+              <w:t xml:space="preserve">Defensoría del Cliente Laguado Giraldo S.A.S. · Calle 70A No. 11-83, Bogotá D.C. · (601) 597 0412, (601) 373 6697 y 320 398 1187 · www.defensorialg.com.co · Lunes a viernes, 9:00 a. m. a 4:00 p. m.</w:t>
             </w:r>
           </w:p>
         </w:tc>
@@ -4114,12 +4114,20 @@
               <w:pStyle w:val="Compact"/>
             </w:pPr>
             <w:r>
-              <w:t xml:space="preserve">[DATOS DE CONTACTO VIGENTES DE LA SUPERINTENDENCIA FINANCIERA]</w:t>
+              <w:t xml:space="preserve">Calle 7 No. 4-49, Bogotá D.C. · Conmutador +57 601 594 0200 · Línea gratuita nacional 01 8000 120 100 · Centro de contacto +57 601 307 8042 · www.superfinanciera.gov.co</w:t>
             </w:r>
           </w:p>
         </w:tc>
       </w:tr>
     </w:tbl>
+    <w:p>
+      <w:pPr>
+        <w:pStyle w:val="BodyText"/>
+      </w:pPr>
+      <w:r>
+        <w:t xml:space="preserve">Los datos de las autoridades, de Coopcentral y de su Defensor se tomaron de sus sitios oficiales el 6 de octubre de 2026. EHOLDINGS los revisa antes de cada publicación de este contrato.</w:t>
+      </w:r>
+    </w:p>
     <w:bookmarkEnd w:id="962"/>
     <w:bookmarkStart w:id="963" w:name="X4872ebfe8d3d11ca7d591af045eddd9b54218b2"/>
     <w:p>
@@ -4344,6 +4352,52 @@
             </w:pPr>
             <w:r>
               <w:t xml:space="preserve">Los términos y condiciones pasan a resumen en lenguaje claro con remisiones. El contrato marco con Coopcentral sale a documento aparte; el cliente conserva la adhesión, con constancia de recibo de Coopcentral. Se incorporan como anexos la tabla de costos (sin porcentajes de usura) y las autorizaciones (once casillas, la undécima voluntaria para datos biométricos, conforme al artículo 6 del Decreto 1377 de 2013). Nueva cláusula vigésima primera de cobranza conforme a los artículos 2, 3, 4, 6 y 7 de la Ley 2300 de 2023. Pagaré con espacios en blanco llenados según la carta de instrucciones (artículo 622 del Código de Comercio). Campos nuevos en el Bloque A para los plazos que no tenían campo. Anexo 3 con canales y causales objetivas de terminación. Modalidad de crédito de consumo y ordinario</w:t>
+            </w:r>
+          </w:p>
+        </w:tc>
+        <w:tc>
+          <w:tcPr/>
+          <w:p>
+            <w:pPr>
+              <w:pStyle w:val="Compact"/>
+            </w:pPr>
+            <w:r>
+              <w:t xml:space="preserve">Reemplazada</w:t>
+            </w:r>
+          </w:p>
+        </w:tc>
+      </w:tr>
+      <w:tr>
+        <w:tc>
+          <w:tcPr/>
+          <w:p>
+            <w:pPr>
+              <w:pStyle w:val="Compact"/>
+            </w:pPr>
+            <w:r>
+              <w:t xml:space="preserve">2.1</w:t>
+            </w:r>
+          </w:p>
+        </w:tc>
+        <w:tc>
+          <w:tcPr/>
+          <w:p>
+            <w:pPr>
+              <w:pStyle w:val="Compact"/>
+            </w:pPr>
+            <w:r>
+              <w:t xml:space="preserve">6 de octubre de 2026</w:t>
+            </w:r>
+          </w:p>
+        </w:tc>
+        <w:tc>
+          <w:tcPr/>
+          <w:p>
+            <w:pPr>
+              <w:pStyle w:val="Compact"/>
+            </w:pPr>
+            <w:r>
+              <w:t xml:space="preserve">Anexo 3: datos de contacto de la Superintendencia de Industria y Comercio, la Superintendencia Financiera, Coopcentral y su Defensor del Consumidor Financiero, tomados de sus sitios oficiales</w:t>
             </w:r>
           </w:p>
         </w:tc>

</xml_diff>